<commit_message>
Apply the job-kit wording fixes to the site and public CV
From the job-applications kit audit (master_resume v5.2), approved by
Mathis on 13 Oct 2026:
- SkillFindr: sole developer of the semantic search component only.
- Drop "privacy-aware"; Ki is "Lloyd's first fully digital follow
  syndicate"; "Prof" without a full stop.
- No en or em dashes: ranges use spaced hyphens. The check now
  enforces this, and the skill and fact map use the new convention.
- CV: Flower out of Skills; the white paper under its own WHITE PAPERS
  heading; KV-cache entry dated Jan - Apr 2026, a coursework report,
  Llama-3.2-1B-Instruct on long-context QA from LongBench; COMP0084
  dated Jan - Apr 2026 with the marginal BM25 gain described as such;
  diffusion heading "Masked Diffusion Planners on Craftax and MiniHack
  (ReMDM)". The Agentic AI hackathon entry is cut to keep two pages.

Claude-Session: https://claude.ai/code/session_01RvraLjyueusnmULu6pGrwz
</commit_message>
<xml_diff>
--- a/cv/mathis-weil-cv.docx
+++ b/cv/mathis-weil-cv.docx
@@ -128,7 +128,7 @@
         <w:spacing w:after="30"/>
       </w:pPr>
       <w:r>
-        <w:t xml:space="preserve">Machine learning under real-world constraints: compute-efficient large language model (LLM) inference, generative models for sequential decision-making, and privacy-aware federated learning.</w:t>
+        <w:t xml:space="preserve">Machine learning under real-world constraints: compute-efficient large language model (LLM) inference, generative models for sequential decision-making, and federated learning.</w:t>
       </w:r>
     </w:p>
     <w:p>
@@ -308,20 +308,6 @@
     </w:p>
     <w:p>
       <w:pPr>
-        <w:pStyle w:val="ListParagraph"/>
-        <w:numPr>
-          <w:ilvl w:val="0"/>
-          <w:numId w:val="2"/>
-        </w:numPr>
-        <w:spacing w:after="20"/>
-      </w:pPr>
-      <w:r>
-        <w:rPr/>
-        <w:t>"The Human Transformation that will Power your Agentic Future". White paper, UCL School of Management Analytics Lab with Capgemini, May 2026 (co-author).</w:t>
-      </w:r>
-    </w:p>
-    <w:p>
-      <w:pPr>
         <w:pStyle w:val="Heading1"/>
         <w:keepNext/>
         <w:pBdr>
@@ -336,6 +322,39 @@
           <w:sz w:val="22"/>
           <w:szCs w:val="22"/>
         </w:rPr>
+        <w:t xml:space="preserve">WHITE PAPERS</w:t>
+      </w:r>
+    </w:p>
+    <w:p>
+      <w:pPr>
+        <w:pStyle w:val="ListParagraph"/>
+        <w:numPr>
+          <w:ilvl w:val="0"/>
+          <w:numId w:val="2"/>
+        </w:numPr>
+        <w:spacing w:after="20"/>
+      </w:pPr>
+      <w:r>
+        <w:rPr/>
+        <w:t>"The Human Transformation that will Power your Agentic Future". White paper, UCL School of Management Analytics Lab with Capgemini, May 2026 (co-author).</w:t>
+      </w:r>
+    </w:p>
+    <w:p>
+      <w:pPr>
+        <w:pStyle w:val="Heading1"/>
+        <w:keepNext/>
+        <w:pBdr>
+          <w:bottom w:val="single" w:color="444444" w:sz="6" w:space="1"/>
+        </w:pBdr>
+        <w:spacing w:after="50" w:before="120"/>
+      </w:pPr>
+      <w:r>
+        <w:rPr>
+          <w:b/>
+          <w:bCs/>
+          <w:sz w:val="22"/>
+          <w:szCs w:val="22"/>
+        </w:rPr>
         <w:t xml:space="preserve">RESEARCH EXPERIENCE</w:t>
       </w:r>
     </w:p>
@@ -367,7 +386,7 @@
           <w:sz w:val="20"/>
           <w:szCs w:val="20"/>
         </w:rPr>
-        <w:t>Lloyd's first fully digital follow syndicate. MSc thesis research embedded in the underwriting team. Supervisor: Prof. Philip Treleaven (UCL).</w:t>
+        <w:t xml:space="preserve">Lloyd's first fully digital follow syndicate. MSc thesis research embedded in the underwriting team. Supervisor: Prof Philip Treleaven (UCL).</w:t>
       </w:r>
     </w:p>
     <w:p>
@@ -461,10 +480,10 @@
           <w:b/>
           <w:bCs/>
         </w:rPr>
-        <w:t>Train as You Evict: Eviction-Aware Fine-Tuning for Compressed KV Cache Inference</w:t>
-      </w:r>
-      <w:r>
-        <w:t xml:space="preserve"> | Jan 2026 - May 2026</w:t>
+        <w:t xml:space="preserve">Train as You Evict: Eviction-Aware Fine-Tuning for Compressed KV Cache Inference</w:t>
+      </w:r>
+      <w:r>
+        <w:t xml:space="preserve"> | Jan 2026 - Apr 2026</w:t>
       </w:r>
     </w:p>
     <w:p>
@@ -479,7 +498,7 @@
           <w:sz w:val="20"/>
           <w:szCs w:val="20"/>
         </w:rPr>
-        <w:t xml:space="preserve">UCL Statistical NLP (module graded 80/100). Team of 5: led the implementation and co-authored the paper (TACL format). Code: github.com/mathisweil/evo-memory (built on the Sakana AI NAMM codebase).</w:t>
+        <w:t xml:space="preserve">UCL Statistical NLP (module graded 80/100). Team of 5: led the implementation and co-authored the report (TACL format; coursework). Code: github.com/mathisweil/evo-memory (built on the Sakana AI NAMM codebase).</w:t>
       </w:r>
     </w:p>
     <w:p>
@@ -502,7 +521,7 @@
         <w:t xml:space="preserve">F1 from 32.6 to 19.0</w:t>
       </w:r>
       <w:r>
-        <w:t xml:space="preserve"> on a long-context QA benchmark (Llama 3.2 1B).</w:t>
+        <w:t xml:space="preserve"> on long-context QA from LongBench (Llama-3.2-1B-Instruct).</w:t>
       </w:r>
     </w:p>
     <w:p>
@@ -548,7 +567,7 @@
           <w:b/>
           <w:bCs/>
         </w:rPr>
-        <w:t xml:space="preserve">Discrete Diffusion Planners on Craftax &amp; MiniHack</w:t>
+        <w:t xml:space="preserve">Masked Diffusion Planners on Craftax and MiniHack (ReMDM)</w:t>
       </w:r>
       <w:r>
         <w:t xml:space="preserve"> | Jan 2026 - Sep 2026</w:t>
@@ -679,7 +698,7 @@
           <w:sz w:val="20"/>
           <w:szCs w:val="20"/>
         </w:rPr>
-        <w:t xml:space="preserve">QMUL final-year dissertation with IBM (sole developer). Supervisor: Aisha Abuelmatti. Code and report: github.com/mathisweil/SkillFindr-SemanticSearchEngine.</w:t>
+        <w:t xml:space="preserve">QMUL final-year dissertation with IBM (sole developer of the semantic search component). Supervisor: Aisha Abuelmatti. Code and report: github.com/mathisweil/SkillFindr-SemanticSearchEngine.</w:t>
       </w:r>
     </w:p>
     <w:p>
@@ -758,7 +777,7 @@
         <w:spacing w:after="20"/>
       </w:pPr>
       <w:r>
-        <w:t xml:space="preserve">Built the full stack end to end: Selenium + BeautifulSoup crawler for 1,200+ course records, hybrid relational-plus-vector store, retrieval API, and RAG integration with an IBM Granite LLM chatbot.</w:t>
+        <w:t xml:space="preserve">Built the component end to end: Selenium + BeautifulSoup crawler for 1,200+ course records, hybrid relational-plus-vector store, retrieval API, and RAG integration with an IBM Granite LLM chatbot.</w:t>
       </w:r>
     </w:p>
     <w:p>
@@ -793,7 +812,7 @@
         <w:t xml:space="preserve">Passage Retrieval and Learning-to-Rank at Scale</w:t>
       </w:r>
       <w:r>
-        <w:t xml:space="preserve"> | Jan 2026 - Mar 2026</w:t>
+        <w:t xml:space="preserve"> | Jan 2026 - Apr 2026</w:t>
       </w:r>
     </w:p>
     <w:p>
@@ -844,7 +863,7 @@
         <w:spacing w:after="20"/>
       </w:pPr>
       <w:r>
-        <w:t xml:space="preserve">Beat tuned BM25 (</w:t>
+        <w:t xml:space="preserve">Edged tuned BM25 (</w:t>
       </w:r>
       <w:r>
         <w:rPr>
@@ -864,36 +883,7 @@
         <w:t xml:space="preserve">909:1</w:t>
       </w:r>
       <w:r>
-        <w:t xml:space="preserve"> class imbalance via L2 regularisation and embedding normalisation.</w:t>
-      </w:r>
-    </w:p>
-    <w:p>
-      <w:pPr>
-        <w:keepNext/>
-        <w:spacing w:after="20" w:before="50"/>
-      </w:pPr>
-      <w:r>
-        <w:rPr>
-          <w:b/>
-          <w:bCs/>
-        </w:rPr>
-        <w:t xml:space="preserve">Agentic AI hackathon builds</w:t>
-      </w:r>
-      <w:r>
-        <w:t xml:space="preserve"> | Nov 2025</w:t>
-      </w:r>
-    </w:p>
-    <w:p>
-      <w:pPr>
-        <w:pStyle w:val="ListParagraph"/>
-        <w:numPr>
-          <w:ilvl w:val="0"/>
-          <w:numId w:val="2"/>
-        </w:numPr>
-        <w:spacing w:after="20"/>
-      </w:pPr>
-      <w:r>
-        <w:t xml:space="preserve">Built autonomous multi-agent systems at the UCL Agentverse Hackathon (partners incl. Anthropic, Amazon) and the Great Agent Hack (partners incl. NVIDIA, AWS): a group-project coordination agent (GroupSync) and an automated job-application agent.</w:t>
+        <w:t xml:space="preserve"> class imbalance by augmenting embeddings with the BM25 score, L2 regularisation and L2-normalisation.</w:t>
       </w:r>
     </w:p>
     <w:p>
@@ -1180,7 +1170,7 @@
         <w:spacing w:after="30"/>
       </w:pPr>
       <w:r>
-        <w:t>Programming: Python (PyTorch, JAX, Hugging Face, PEFT, XGBoost, Flower, NumPy, pandas, scikit-learn), SQL (PostgreSQL, pgvector), R, Java, Git, Linux, Docker, GCP, Weights &amp; Biases, pytest</w:t>
+        <w:t xml:space="preserve">Programming: Python (PyTorch, JAX, Hugging Face, PEFT, XGBoost, NumPy, pandas, scikit-learn), SQL (PostgreSQL, pgvector), R, Java, Git, Linux, Docker, GCP, Weights &amp; Biases, pytest</w:t>
       </w:r>
     </w:p>
     <w:p>

</xml_diff>